<commit_message>
Apply DC-001 consistent network entity modelling
</commit_message>
<xml_diff>
--- a/01-engineering-source-documents/OT Engineering Design Brief.docx
+++ b/01-engineering-source-documents/OT Engineering Design Brief.docx
@@ -3604,107 +3604,33 @@
       </w:r>
     </w:p>
     <w:p>
-      <w:pPr>
-        <w:spacing w:after="240" w:before="240" w:lineRule="auto"/>
-        <w:rPr/>
-      </w:pPr>
-      <w:r>
-        <w:rPr>
-          <w:rtl w:val="0"/>
-        </w:rPr>
-        <w:t xml:space="preserve">Each primary feeder will include sectionalising switches between adjacent distribution sections. This provides a consistent switching structure across the two feeder models and allows network portions to be independently separated where required.</w:t>
-      </w:r>
-    </w:p>
-    <w:p>
-      <w:pPr>
-        <w:spacing w:after="240" w:before="240" w:lineRule="auto"/>
-        <w:rPr/>
-      </w:pPr>
-      <w:r>
-        <w:rPr>
-          <w:rtl w:val="0"/>
-        </w:rPr>
-        <w:t xml:space="preserve">For the selected validation scenario, the switches immediately upstream and downstream of the predefined faulted section will be used to electrically isolate that section before restoration. Sectionalising devices elsewhere in the network will normally remain closed but will remain part of the configured topology and monitored operational state.</w:t>
-      </w:r>
-    </w:p>
-    <w:p>
-      <w:pPr>
-        <w:spacing w:after="240" w:before="240" w:lineRule="auto"/>
-        <w:rPr/>
-      </w:pPr>
-      <w:r>
-        <w:rPr>
-          <w:rtl w:val="0"/>
-        </w:rPr>
-        <w:t xml:space="preserve">The detailed number, identifiers and locations of these devices will be defined in the Network Model.</w:t>
-      </w:r>
-      <w:r>
-        <w:rPr>
-          <w:rtl w:val="0"/>
-        </w:rPr>
-      </w:r>
-    </w:p>
-    <w:p>
-      <w:pPr>
-        <w:spacing w:after="240" w:before="240" w:lineRule="auto"/>
-        <w:rPr/>
-      </w:pPr>
-      <w:r>
-        <w:rPr>
-          <w:rtl w:val="0"/>
-        </w:rPr>
-        <w:t xml:space="preserve">This requirement emerged from Engineering Investigation A and C.</w:t>
-      </w:r>
-    </w:p>
-    <w:p>
-      <w:pPr>
-        <w:spacing w:after="240" w:before="240" w:lineRule="auto"/>
-        <w:rPr/>
-      </w:pPr>
-      <w:r>
-        <w:rPr>
-          <w:rtl w:val="0"/>
-        </w:rPr>
-        <w:t xml:space="preserve">It would be technically inconsistent to restore a healthy downstream section through the alternate feeder while leaving an electrical path through the fault.</w:t>
-      </w:r>
-    </w:p>
-    <w:p>
-      <w:pPr>
-        <w:spacing w:after="240" w:before="240" w:lineRule="auto"/>
-        <w:rPr/>
-      </w:pPr>
-      <w:r>
-        <w:rPr>
-          <w:rtl w:val="0"/>
-        </w:rPr>
-        <w:t xml:space="preserve">The final device arrangement will therefore provide a means to isolate the faulted section before alternate supply is established.</w:t>
-      </w:r>
-    </w:p>
-    <w:p>
-      <w:pPr>
-        <w:spacing w:after="240" w:before="240" w:lineRule="auto"/>
-        <w:rPr/>
-      </w:pPr>
-      <w:r>
-        <w:rPr>
-          <w:rtl w:val="0"/>
-        </w:rPr>
-        <w:t xml:space="preserve">The Design Brief intentionally does not yet specify the exact number or location of sectionalising switches; those will be selected when the detailed Network Model is created.</w:t>
-      </w:r>
-    </w:p>
-    <w:p>
-      <w:pPr>
-        <w:rPr/>
-      </w:pPr>
-      <w:r>
-        <w:pict>
-          <v:rect style="width:0.0pt;height:1.5pt" o:hr="t" o:hrstd="t" o:hralign="center" fillcolor="#A0A0A0" stroked="f"/>
-        </w:pict>
-      </w:r>
-      <w:r>
-        <w:rPr>
-          <w:rtl w:val="0"/>
-        </w:rPr>
+      <w:pPr/>
+      <w:r>
+        <w:t>Each primary feeder will use a consistent sectional structure in which adjacent distribution sections are separated by sectionalising switches. This provides equivalent modelling capability across the two feeder networks and avoids arbitrary structural differences that exist only because one feeder is used by the formal validation scenario.</w:t>
+      </w:r>
+    </w:p>
+    <w:p>
+      <w:pPr/>
+      <w:r>
+        <w:t>Sectionalising switches will be represented consistently as network devices with stable identifiers, configured connectivity, normal state, current operational state and associated telemetry information where monitored. Individual switch states and operational roles may differ, but those differences will arise from the network configuration or scenario rather than from inconsistent entity modelling.</w:t>
+      </w:r>
+    </w:p>
+    <w:p>
+      <w:pPr/>
+      <w:r>
+        <w:t>For the formal feeder-fault validation scenario, the sectionalising switches immediately upstream and downstream of the designated faulted section will be used to isolate that section before restoration. Other sectionalising switches will normally remain closed but will remain part of the configured topology and current operational state, and therefore contribute to source-path and restoration-path determination.</w:t>
+      </w:r>
+    </w:p>
+    <w:p>
+      <w:pPr/>
+      <w:r>
+        <w:t>The detailed number, identifiers and locations of sectionalising switches will be defined in the Network Model. The Network Model may use a symmetric sectional structure across the two primary feeders where this improves clarity and professional consistency without adding unnecessary operational complexity.</w:t>
+      </w:r>
+    </w:p>
+    <w:p>
+      <w:pPr/>
+      <w:r>
+        <w:t>This design refinement preserves the investigation finding that only the minimum switching capability required for credible isolation and restoration needs to be actively operated during the formal scenario; it does not require every represented device to participate in that scenario.</w:t>
       </w:r>
     </w:p>
     <w:p>
@@ -18478,6 +18404,57 @@
           </w:p>
         </w:tc>
       </w:tr>
+      <w:tr>
+        <w:trPr>
+          <w:cantSplit w:val="0"/>
+          <w:trHeight w:val="525" w:hRule="atLeast"/>
+          <w:tblHeader w:val="0"/>
+        </w:trPr>
+        <w:tc>
+          <w:tcPr>
+            <w:tcBorders>
+              <w:top w:color="000000" w:space="0" w:sz="6" w:val="single"/>
+              <w:left w:color="000000" w:space="0" w:sz="6" w:val="single"/>
+              <w:bottom w:color="000000" w:space="0" w:sz="6" w:val="single"/>
+              <w:right w:color="000000" w:space="0" w:sz="6" w:val="single"/>
+            </w:tcBorders>
+            <w:tcMar>
+              <w:top w:w="120.0" w:type="dxa"/>
+              <w:left w:w="180.0" w:type="dxa"/>
+              <w:bottom w:w="120.0" w:type="dxa"/>
+              <w:right w:w="180.0" w:type="dxa"/>
+            </w:tcMar>
+            <w:vAlign w:val="top"/>
+          </w:tcPr>
+          <w:p>
+            <w:r>
+              <w:t>DD-19</w:t>
+            </w:r>
+          </w:p>
+        </w:tc>
+        <w:tc>
+          <w:tcPr>
+            <w:tcBorders>
+              <w:top w:color="000000" w:space="0" w:sz="6" w:val="single"/>
+              <w:left w:color="000000" w:space="0" w:sz="6" w:val="single"/>
+              <w:bottom w:color="000000" w:space="0" w:sz="6" w:val="single"/>
+              <w:right w:color="000000" w:space="0" w:sz="6" w:val="single"/>
+            </w:tcBorders>
+            <w:tcMar>
+              <w:top w:w="120.0" w:type="dxa"/>
+              <w:left w:w="180.0" w:type="dxa"/>
+              <w:bottom w:w="120.0" w:type="dxa"/>
+              <w:right w:w="180.0" w:type="dxa"/>
+            </w:tcMar>
+            <w:vAlign w:val="top"/>
+          </w:tcPr>
+          <w:p>
+            <w:r>
+              <w:t>Model equivalent engineering entities consistently across the network unless a documented engineering reason justifies a difference; use equivalent sectionalising structure on both primary feeders.</w:t>
+            </w:r>
+          </w:p>
+        </w:tc>
+      </w:tr>
     </w:tbl>
     <w:p>
       <w:pPr>

</xml_diff>

<commit_message>
Apply DC-002 selectable fault location exploration mode
</commit_message>
<xml_diff>
--- a/01-engineering-source-documents/OT Engineering Design Brief.docx
+++ b/01-engineering-source-documents/OT Engineering Design Brief.docx
@@ -34,50 +34,13 @@
         <w:rPr/>
       </w:pPr>
       <w:r>
-        <w:rPr>
-          <w:b w:val="1"/>
-          <w:bCs w:val="1"/>
-          <w:rtl w:val="0"/>
-        </w:rPr>
-        <w:t xml:space="preserve">Operational Technology Graduate Demonstration Project</w:t>
-        <w:br w:type="textWrapping"/>
-        <w:t xml:space="preserve">Document:</w:t>
-      </w:r>
-      <w:r>
-        <w:rPr>
-          <w:rtl w:val="0"/>
-        </w:rPr>
-        <w:t xml:space="preserve"> Engineering Design Brief</w:t>
-        <w:br w:type="textWrapping"/>
-      </w:r>
-      <w:r>
-        <w:rPr>
-          <w:b w:val="1"/>
-          <w:bCs w:val="1"/>
-          <w:rtl w:val="0"/>
-        </w:rPr>
-        <w:t xml:space="preserve">Version:</w:t>
-      </w:r>
-      <w:r>
-        <w:rPr>
-          <w:rtl w:val="0"/>
-        </w:rPr>
-        <w:t xml:space="preserve"> 0.1</w:t>
-        <w:br w:type="textWrapping"/>
-      </w:r>
-      <w:r>
-        <w:rPr>
-          <w:b w:val="1"/>
-          <w:bCs w:val="1"/>
-          <w:rtl w:val="0"/>
-        </w:rPr>
-        <w:t xml:space="preserve">Status:</w:t>
-      </w:r>
-      <w:r>
-        <w:rPr>
-          <w:rtl w:val="0"/>
-        </w:rPr>
-        <w:t xml:space="preserve"> Draft</w:t>
+        <w:t>Operational Technology Graduate Demonstration Project</w:t>
+        <w:br/>
+        <w:t>Document: Engineering Design Brief</w:t>
+        <w:br/>
+        <w:t>Version: 0.3</w:t>
+        <w:br/>
+        <w:t>Status: Draft</w:t>
       </w:r>
     </w:p>
     <w:p>
@@ -151,10 +114,7 @@
         <w:rPr/>
       </w:pPr>
       <w:r>
-        <w:rPr>
-          <w:rtl w:val="0"/>
-        </w:rPr>
-        <w:t xml:space="preserve">The design will support a single feeder-fault scenario progressing through:</w:t>
+        <w:t>The design will support one fixed formal validation scenario and a separate reviewer-driven exploration mode. Both use the same underlying feeder-fault workflow:</w:t>
       </w:r>
     </w:p>
     <w:p>
@@ -173,6 +133,18 @@
           <w:rtl w:val="0"/>
         </w:rPr>
         <w:t xml:space="preserve">fault occurrence → feeder protection operation → operational-state update → topology recalculation → outage identification → affected-customer assessment → restoration assessment → simulated restoration → event recording and validation.</w:t>
+      </w:r>
+    </w:p>
+    <w:p>
+      <w:pPr/>
+      <w:r>
+        <w:t>For formal engineering validation, the controlled baseline fault location remains SEC-A2 once established by the Network Model. Exploration mode may instead designate another represented distribution section as the active fault location so that a reviewer can observe topology-derived consequences without changing the formal validation baseline.</w:t>
+      </w:r>
+    </w:p>
+    <w:p>
+      <w:pPr/>
+      <w:r>
+        <w:t>Fault type remains deliberately abstract in both modes: a distribution-section fault that results in operation of the relevant feeder protection and opening of the affected feeder source breaker. Detailed electrical fault categories and protection calculations remain outside scope.</w:t>
       </w:r>
     </w:p>
     <w:p>
@@ -3158,7 +3130,7 @@
         <w:rPr>
           <w:rtl w:val="0"/>
         </w:rPr>
-        <w:t xml:space="preserve">The second feeder will serve as the alternate source for restoration of an eligible healthy portion of the first feeder.</w:t>
+        <w:t>For the controlled formal validation scenario, Feeder B will serve as the alternate source for restoration of an eligible healthy portion of Feeder A. In Exploration Mode, either feeder may become the affected feeder or the alternate feeder according to the reviewer-selected fault location and the resulting network topology.</w:t>
       </w:r>
     </w:p>
     <w:p>
@@ -7893,34 +7865,43 @@
         <w:rPr/>
       </w:pPr>
       <w:r>
-        <w:rPr>
-          <w:rtl w:val="0"/>
-        </w:rPr>
-        <w:t xml:space="preserve">A fault is introduced on the predefined fault section.</w:t>
-      </w:r>
-    </w:p>
-    <w:p>
-      <w:pPr>
-        <w:spacing w:after="240" w:before="240" w:lineRule="auto"/>
-        <w:rPr/>
-      </w:pPr>
-      <w:r>
-        <w:rPr>
-          <w:rtl w:val="0"/>
-        </w:rPr>
-        <w:t xml:space="preserve">The precise section will be selected during the detailed Network Model stage.</w:t>
-      </w:r>
-    </w:p>
-    <w:p>
-      <w:pPr>
-        <w:spacing w:after="240" w:before="240" w:lineRule="auto"/>
-        <w:rPr/>
-      </w:pPr>
-      <w:r>
-        <w:rPr>
-          <w:rtl w:val="0"/>
-        </w:rPr>
-        <w:t xml:space="preserve">Detailed fault-current behaviour is not simulated.</w:t>
+        <w:t>The demonstrator supports two scenario contexts: a controlled formal validation baseline and a reviewer-driven exploration mode.</w:t>
+      </w:r>
+    </w:p>
+    <w:p>
+      <w:pPr>
+        <w:spacing w:after="240" w:before="240" w:lineRule="auto"/>
+        <w:rPr/>
+      </w:pPr>
+      <w:r>
+        <w:t>Formal validation baseline: the active fault section is the section defined by the Network Model for the controlled validation package (SEC-A2 in the current baseline). Expected results, seeded-defect evidence and repeat validation remain tied to this fixed scenario.</w:t>
+      </w:r>
+    </w:p>
+    <w:p>
+      <w:pPr>
+        <w:spacing w:after="240" w:before="240" w:lineRule="auto"/>
+        <w:rPr/>
+      </w:pPr>
+      <w:r>
+        <w:t>Exploration mode: the reviewer may select any represented distribution section as the active fault location. The selected location is treated as a scenario input, not as a change to persistent network configuration.</w:t>
+      </w:r>
+    </w:p>
+    <w:p>
+      <w:pPr/>
+      <w:r>
+        <w:t>In either mode, the fault event itself is represented generically as a distribution-section fault that causes the relevant feeder protection to operate. The demonstrator does not offer selectable electrical fault types such as phase-to-ground, phase-to-phase or three-phase faults because modelling those distinctions credibly would require protection and fault-analysis scope that this project intentionally excludes.</w:t>
+      </w:r>
+    </w:p>
+    <w:p>
+      <w:pPr/>
+      <w:r>
+        <w:t>The affected feeder source breaker is determined from the feeder association of the active faulted section. Subsequent de-energisation, outage extent, customer impact, isolation opportunities and restoration assessment are derived from the same network model and operational logic used by the formal scenario.</w:t>
+      </w:r>
+    </w:p>
+    <w:p>
+      <w:pPr/>
+      <w:r>
+        <w:t>Exploration mode does not guarantee that every selected fault has a successful restoration. A scenario may legitimately produce no restoration candidate, a REJECTED assessment, or a BLOCKED assessment where that outcome follows from topology, capacity or telemetry conditions.</w:t>
       </w:r>
     </w:p>
     <w:p>
@@ -15733,6 +15714,60 @@
     </w:p>
     <w:p>
       <w:pPr>
+        <w:pStyle w:val="Heading2"/>
+      </w:pPr>
+      <w:r>
+        <w:t>17.2 Formal Validation Mode and Exploration Mode</w:t>
+      </w:r>
+    </w:p>
+    <w:p>
+      <w:pPr/>
+      <w:r>
+        <w:t>The demonstrator shall present formal validation and exploration as distinct operating contexts so that flexibility in the demonstration does not weaken the controlled engineering evidence.</w:t>
+      </w:r>
+    </w:p>
+    <w:p>
+      <w:pPr>
+        <w:pStyle w:val="Heading3"/>
+      </w:pPr>
+      <w:r>
+        <w:t>Formal Validation Mode</w:t>
+      </w:r>
+    </w:p>
+    <w:p>
+      <w:pPr/>
+      <w:r>
+        <w:t>Uses the controlled validation scenario, expected results, configuration version and test evidence defined by the engineering package. Reviewer interaction may execute the scenario, but the scenario definition itself is not altered by exploratory selections.</w:t>
+      </w:r>
+    </w:p>
+    <w:p>
+      <w:pPr>
+        <w:pStyle w:val="Heading3"/>
+      </w:pPr>
+      <w:r>
+        <w:t>Exploration Mode</w:t>
+      </w:r>
+    </w:p>
+    <w:p>
+      <w:pPr/>
+      <w:r>
+        <w:t>Allows the reviewer to choose a represented distribution section as the initiating fault location and run the same generic operational logic against that selection. The purpose is to demonstrate that breaker operation, topology, outage extent, customer impact and restoration reasoning arise from the engineering model rather than from one canned fault animation.</w:t>
+      </w:r>
+    </w:p>
+    <w:p>
+      <w:pPr/>
+      <w:r>
+        <w:t>Exploration outcomes are informative demonstration results, not formal project validation evidence unless a scenario is separately defined and executed as a controlled validation test. The interface shall therefore make the current mode clear.</w:t>
+      </w:r>
+    </w:p>
+    <w:p>
+      <w:pPr/>
+      <w:r>
+        <w:t>Exploration mode shall not expose selectable electrical fault physics. The event remains a generic distribution-section fault resulting in feeder protection operation.</w:t>
+      </w:r>
+    </w:p>
+    <w:p>
+      <w:pPr>
         <w:pStyle w:val="Heading1"/>
         <w:keepNext w:val="0"/>
         <w:keepLines w:val="0"/>
@@ -16463,10 +16498,7 @@
         <w:rPr/>
       </w:pPr>
       <w:r>
-        <w:rPr>
-          <w:rtl w:val="0"/>
-        </w:rPr>
-        <w:t xml:space="preserve">Protection correctly detects the predefined fault and opens the appropriate feeder breaker.</w:t>
+        <w:t>Protection correctly detects the active scenario fault and opens the appropriate feeder breaker.</w:t>
       </w:r>
     </w:p>
     <w:p>
@@ -16503,10 +16535,7 @@
         <w:rPr/>
       </w:pPr>
       <w:r>
-        <w:rPr>
-          <w:rtl w:val="0"/>
-        </w:rPr>
-        <w:t xml:space="preserve">The faulted network section is known as part of the validation scenario; no fault-location algorithm is required.</w:t>
+        <w:t>For formal validation, the faulted network section is defined by the controlled scenario. In exploration mode, the reviewer supplies the active fault location by selecting a represented distribution section. No fault-location algorithm is required.</w:t>
       </w:r>
     </w:p>
     <w:p>
@@ -18455,6 +18484,108 @@
           </w:p>
         </w:tc>
       </w:tr>
+      <w:tr>
+        <w:trPr>
+          <w:cantSplit w:val="0"/>
+          <w:trHeight w:val="525" w:hRule="atLeast"/>
+          <w:tblHeader w:val="0"/>
+        </w:trPr>
+        <w:tc>
+          <w:tcPr>
+            <w:tcBorders>
+              <w:top w:color="000000" w:space="0" w:sz="6" w:val="single"/>
+              <w:left w:color="000000" w:space="0" w:sz="6" w:val="single"/>
+              <w:bottom w:color="000000" w:space="0" w:sz="6" w:val="single"/>
+              <w:right w:color="000000" w:space="0" w:sz="6" w:val="single"/>
+            </w:tcBorders>
+            <w:tcMar>
+              <w:top w:w="120.0" w:type="dxa"/>
+              <w:left w:w="180.0" w:type="dxa"/>
+              <w:bottom w:w="120.0" w:type="dxa"/>
+              <w:right w:w="180.0" w:type="dxa"/>
+            </w:tcMar>
+            <w:vAlign w:val="top"/>
+          </w:tcPr>
+          <w:p>
+            <w:r>
+              <w:t>DD-20</w:t>
+            </w:r>
+          </w:p>
+        </w:tc>
+        <w:tc>
+          <w:tcPr>
+            <w:tcBorders>
+              <w:top w:color="000000" w:space="0" w:sz="6" w:val="single"/>
+              <w:left w:color="000000" w:space="0" w:sz="6" w:val="single"/>
+              <w:bottom w:color="000000" w:space="0" w:sz="6" w:val="single"/>
+              <w:right w:color="000000" w:space="0" w:sz="6" w:val="single"/>
+            </w:tcBorders>
+            <w:tcMar>
+              <w:top w:w="120.0" w:type="dxa"/>
+              <w:left w:w="180.0" w:type="dxa"/>
+              <w:bottom w:w="120.0" w:type="dxa"/>
+              <w:right w:w="180.0" w:type="dxa"/>
+            </w:tcMar>
+            <w:vAlign w:val="top"/>
+          </w:tcPr>
+          <w:p>
+            <w:r>
+              <w:t>Separate the fixed formal validation scenario from reviewer-driven exploration mode; exploration may select the active fault section while formal validation remains tied to the controlled baseline.</w:t>
+            </w:r>
+          </w:p>
+        </w:tc>
+      </w:tr>
+      <w:tr>
+        <w:trPr>
+          <w:cantSplit w:val="0"/>
+          <w:trHeight w:val="525" w:hRule="atLeast"/>
+          <w:tblHeader w:val="0"/>
+        </w:trPr>
+        <w:tc>
+          <w:tcPr>
+            <w:tcBorders>
+              <w:top w:color="000000" w:space="0" w:sz="6" w:val="single"/>
+              <w:left w:color="000000" w:space="0" w:sz="6" w:val="single"/>
+              <w:bottom w:color="000000" w:space="0" w:sz="6" w:val="single"/>
+              <w:right w:color="000000" w:space="0" w:sz="6" w:val="single"/>
+            </w:tcBorders>
+            <w:tcMar>
+              <w:top w:w="120.0" w:type="dxa"/>
+              <w:left w:w="180.0" w:type="dxa"/>
+              <w:bottom w:w="120.0" w:type="dxa"/>
+              <w:right w:w="180.0" w:type="dxa"/>
+            </w:tcMar>
+            <w:vAlign w:val="top"/>
+          </w:tcPr>
+          <w:p>
+            <w:r>
+              <w:t>DD-21</w:t>
+            </w:r>
+          </w:p>
+        </w:tc>
+        <w:tc>
+          <w:tcPr>
+            <w:tcBorders>
+              <w:top w:color="000000" w:space="0" w:sz="6" w:val="single"/>
+              <w:left w:color="000000" w:space="0" w:sz="6" w:val="single"/>
+              <w:bottom w:color="000000" w:space="0" w:sz="6" w:val="single"/>
+              <w:right w:color="000000" w:space="0" w:sz="6" w:val="single"/>
+            </w:tcBorders>
+            <w:tcMar>
+              <w:top w:w="120.0" w:type="dxa"/>
+              <w:left w:w="180.0" w:type="dxa"/>
+              <w:bottom w:w="120.0" w:type="dxa"/>
+              <w:right w:w="180.0" w:type="dxa"/>
+            </w:tcMar>
+            <w:vAlign w:val="top"/>
+          </w:tcPr>
+          <w:p>
+            <w:r>
+              <w:t>Keep fault type abstract and fixed as a distribution-section fault causing feeder protection operation; do not introduce selectable electrical fault types or protection-analysis behaviour.</w:t>
+            </w:r>
+          </w:p>
+        </w:tc>
+      </w:tr>
     </w:tbl>
     <w:p>
       <w:pPr>

</xml_diff>

<commit_message>
Revised project validation plan (step 9) and DC-003 applied
</commit_message>
<xml_diff>
--- a/01-engineering-source-documents/OT Engineering Design Brief.docx
+++ b/01-engineering-source-documents/OT Engineering Design Brief.docx
@@ -34,11 +34,14 @@
         <w:rPr/>
       </w:pPr>
       <w:r>
+        <w:rPr>
+          <w:sz w:val="20"/>
+        </w:rPr>
         <w:t>Operational Technology Graduate Demonstration Project</w:t>
         <w:br/>
         <w:t>Document: Engineering Design Brief</w:t>
         <w:br/>
-        <w:t>Version: 0.3</w:t>
+        <w:t>Version: 0.4</w:t>
         <w:br/>
         <w:t>Status: Draft</w:t>
       </w:r>
@@ -4625,7 +4628,7 @@
           <wp:inline distB="114300" distT="114300" distL="114300" distR="114300">
             <wp:extent cx="4981575" cy="5038725"/>
             <wp:effectExtent b="0" l="0" r="0" t="0"/>
-            <wp:docPr id="1" name="image1.png"/>
+            <wp:docPr id="1" name="image1.png" title="Conceptual OT system architecture" descr="Logical information flow between GIS/network configuration, SCADA, ADMS, OMS, operational event and audit records, and the engineering validation package."/>
             <a:graphic>
               <a:graphicData uri="http://schemas.openxmlformats.org/drawingml/2006/picture">
                 <pic:pic>
@@ -18586,6 +18589,76 @@
           </w:p>
         </w:tc>
       </w:tr>
+      <w:tr>
+        <w:trPr>
+          <w:cantSplit w:val="0"/>
+          <w:trHeight w:val="525" w:hRule="atLeast"/>
+          <w:tblHeader w:val="0"/>
+          <w:cantSplit/>
+        </w:trPr>
+        <w:tc>
+          <w:tcPr>
+            <w:tcBorders>
+              <w:top w:color="000000" w:space="0" w:sz="6" w:val="single"/>
+              <w:left w:color="000000" w:space="0" w:sz="6" w:val="single"/>
+              <w:bottom w:color="000000" w:space="0" w:sz="6" w:val="single"/>
+              <w:right w:color="000000" w:space="0" w:sz="6" w:val="single"/>
+            </w:tcBorders>
+            <w:tcMar>
+              <w:top w:w="80" w:type="dxa"/>
+              <w:left w:w="180.0" w:type="dxa"/>
+              <w:bottom w:w="80" w:type="dxa"/>
+              <w:right w:w="180.0" w:type="dxa"/>
+              <w:start w:w="100" w:type="dxa"/>
+              <w:end w:w="100" w:type="dxa"/>
+            </w:tcMar>
+            <w:vAlign w:val="top"/>
+          </w:tcPr>
+          <w:p>
+            <w:pPr>
+              <w:spacing w:before="20" w:after="20"/>
+            </w:pPr>
+            <w:r>
+              <w:rPr>
+                <w:rFonts w:ascii="Roboto Mono" w:hAnsi="Roboto Mono" w:eastAsia="Roboto Mono"/>
+                <w:color w:val="188038"/>
+                <w:sz w:val="16"/>
+              </w:rPr>
+              <w:t>DD-22</w:t>
+            </w:r>
+          </w:p>
+        </w:tc>
+        <w:tc>
+          <w:tcPr>
+            <w:tcBorders>
+              <w:top w:color="000000" w:space="0" w:sz="6" w:val="single"/>
+              <w:left w:color="000000" w:space="0" w:sz="6" w:val="single"/>
+              <w:bottom w:color="000000" w:space="0" w:sz="6" w:val="single"/>
+              <w:right w:color="000000" w:space="0" w:sz="6" w:val="single"/>
+            </w:tcBorders>
+            <w:tcMar>
+              <w:top w:w="80" w:type="dxa"/>
+              <w:left w:w="180.0" w:type="dxa"/>
+              <w:bottom w:w="80" w:type="dxa"/>
+              <w:right w:w="180.0" w:type="dxa"/>
+              <w:start w:w="100" w:type="dxa"/>
+              <w:end w:w="100" w:type="dxa"/>
+            </w:tcMar>
+            <w:vAlign w:val="top"/>
+          </w:tcPr>
+          <w:p>
+            <w:pPr>
+              <w:spacing w:before="20" w:after="20"/>
+            </w:pPr>
+            <w:r>
+              <w:rPr>
+                <w:sz w:val="16"/>
+              </w:rPr>
+              <w:t>Derive active-fault isolation boundaries from configuration incidence; distinguish trustworthy OPEN, trustworthy CLOSED and UNPROVEN boundary evidence; prove isolation only when every incident boundary is proven OPEN and no active source path reaches the fault.</w:t>
+            </w:r>
+          </w:p>
+        </w:tc>
+      </w:tr>
     </w:tbl>
     <w:p>
       <w:pPr>
@@ -19058,6 +19131,558 @@
           <w:rtl w:val="0"/>
         </w:rPr>
         <w:t xml:space="preserve">This remains consistent with the overarching project objective: to resemble a credible junior engineering contribution to an OT upgrade rather than a standalone software product. </w:t>
+      </w:r>
+    </w:p>
+    <w:p>
+      <w:pPr>
+        <w:pStyle w:val="Heading1"/>
+        <w:keepNext/>
+      </w:pPr>
+      <w:r>
+        <w:t>23. Controlled Amendment — DC-003 Generic Active-Fault Isolation</w:t>
+      </w:r>
+    </w:p>
+    <w:p>
+      <w:pPr>
+        <w:pStyle w:val="Heading2"/>
+        <w:keepNext/>
+      </w:pPr>
+      <w:r>
+        <w:t>23.1 Design Need and Retained Baseline</w:t>
+      </w:r>
+    </w:p>
+    <w:p>
+      <w:pPr>
+        <w:spacing w:before="120" w:after="120"/>
+      </w:pPr>
+      <w:r>
+        <w:rPr>
+          <w:b w:val="0"/>
+          <w:i w:val="0"/>
+        </w:rPr>
+        <w:t>DC-003 closes the implementation ambiguity identified by DQ-001 without changing the formal SEC-A2 scenario, the abstract fault type, any restoration criterion, or the requirement count. The active fault remains transient scenario state. Configuration remains the source of persistent connectivity; observed device state remains separate from derived isolation status and action availability.</w:t>
+      </w:r>
+    </w:p>
+    <w:p>
+      <w:pPr>
+        <w:pStyle w:val="Heading2"/>
+        <w:keepNext/>
+      </w:pPr>
+      <w:r>
+        <w:t>23.2 Configuration-Driven Boundary Derivation</w:t>
+      </w:r>
+    </w:p>
+    <w:p>
+      <w:pPr>
+        <w:spacing w:before="120" w:after="120"/>
+      </w:pPr>
+      <w:r>
+        <w:rPr>
+          <w:b w:val="0"/>
+          <w:i w:val="0"/>
+        </w:rPr>
+        <w:t>For the active fault section, the design queries the selected immutable network configuration for every switchable device directly incident to that section. Those devices are the isolation boundaries. A boundary can therefore be a source breaker, sectionalising switch or the normally-open tie switch. The same rule is used for the fixed SEC-A2 formal scenario and every Exploration Mode selection; section-ID conditionals and stored per-section consequences are prohibited.</w:t>
+      </w:r>
+    </w:p>
+    <w:tbl>
+      <w:tblPr>
+        <w:tblW w:type="auto" w:w="0"/>
+        <w:jc w:val="center"/>
+        <w:tblLayout w:type="fixed"/>
+        <w:tblLook w:firstColumn="1" w:firstRow="1" w:lastColumn="0" w:lastRow="0" w:noHBand="0" w:noVBand="1" w:val="04A0"/>
+        <w:tblBorders>
+          <w:top w:val="single" w:sz="10" w:space="0" w:color="000000"/>
+          <w:left w:val="single" w:sz="10" w:space="0" w:color="000000"/>
+          <w:bottom w:val="single" w:sz="10" w:space="0" w:color="000000"/>
+          <w:right w:val="single" w:sz="10" w:space="0" w:color="000000"/>
+          <w:insideH w:val="single" w:sz="10" w:space="0" w:color="000000"/>
+          <w:insideV w:val="single" w:sz="10" w:space="0" w:color="000000"/>
+        </w:tblBorders>
+      </w:tblPr>
+      <w:tblGrid>
+        <w:gridCol w:w="2340"/>
+        <w:gridCol w:w="2340"/>
+        <w:gridCol w:w="2340"/>
+        <w:gridCol w:w="2340"/>
+      </w:tblGrid>
+      <w:tr>
+        <w:trPr>
+          <w:tblHeader w:val="true"/>
+          <w:cantSplit/>
+        </w:trPr>
+        <w:tc>
+          <w:tcPr>
+            <w:tcW w:type="dxa" w:w="1872"/>
+            <w:shd w:fill="E7E7E7"/>
+            <w:tcMar>
+              <w:top w:w="80" w:type="dxa"/>
+              <w:start w:w="100" w:type="dxa"/>
+              <w:bottom w:w="80" w:type="dxa"/>
+              <w:end w:w="100" w:type="dxa"/>
+            </w:tcMar>
+            <w:vAlign w:val="center"/>
+          </w:tcPr>
+          <w:p>
+            <w:pPr>
+              <w:spacing w:before="40" w:after="40"/>
+              <w:jc w:val="center"/>
+            </w:pPr>
+            <w:r>
+              <w:rPr>
+                <w:b/>
+                <w:sz w:val="16"/>
+              </w:rPr>
+              <w:t>Condition</w:t>
+            </w:r>
+          </w:p>
+        </w:tc>
+        <w:tc>
+          <w:tcPr>
+            <w:tcW w:type="dxa" w:w="2880"/>
+            <w:shd w:fill="E7E7E7"/>
+            <w:tcMar>
+              <w:top w:w="80" w:type="dxa"/>
+              <w:start w:w="100" w:type="dxa"/>
+              <w:bottom w:w="80" w:type="dxa"/>
+              <w:end w:w="100" w:type="dxa"/>
+            </w:tcMar>
+            <w:vAlign w:val="center"/>
+          </w:tcPr>
+          <w:p>
+            <w:pPr>
+              <w:spacing w:before="40" w:after="40"/>
+              <w:jc w:val="center"/>
+            </w:pPr>
+            <w:r>
+              <w:rPr>
+                <w:b/>
+                <w:sz w:val="16"/>
+              </w:rPr>
+              <w:t>Controlled evidence</w:t>
+            </w:r>
+          </w:p>
+        </w:tc>
+        <w:tc>
+          <w:tcPr>
+            <w:tcW w:type="dxa" w:w="2160"/>
+            <w:shd w:fill="E7E7E7"/>
+            <w:tcMar>
+              <w:top w:w="80" w:type="dxa"/>
+              <w:start w:w="100" w:type="dxa"/>
+              <w:bottom w:w="80" w:type="dxa"/>
+              <w:end w:w="100" w:type="dxa"/>
+            </w:tcMar>
+            <w:vAlign w:val="center"/>
+          </w:tcPr>
+          <w:p>
+            <w:pPr>
+              <w:spacing w:before="40" w:after="40"/>
+              <w:jc w:val="center"/>
+            </w:pPr>
+            <w:r>
+              <w:rPr>
+                <w:b/>
+                <w:sz w:val="16"/>
+              </w:rPr>
+              <w:t>Derived boundary result</w:t>
+            </w:r>
+          </w:p>
+        </w:tc>
+        <w:tc>
+          <w:tcPr>
+            <w:tcW w:type="dxa" w:w="2448"/>
+            <w:shd w:fill="E7E7E7"/>
+            <w:tcMar>
+              <w:top w:w="80" w:type="dxa"/>
+              <w:start w:w="100" w:type="dxa"/>
+              <w:bottom w:w="80" w:type="dxa"/>
+              <w:end w:w="100" w:type="dxa"/>
+            </w:tcMar>
+            <w:vAlign w:val="center"/>
+          </w:tcPr>
+          <w:p>
+            <w:pPr>
+              <w:spacing w:before="40" w:after="40"/>
+              <w:jc w:val="center"/>
+            </w:pPr>
+            <w:r>
+              <w:rPr>
+                <w:b/>
+                <w:sz w:val="16"/>
+              </w:rPr>
+              <w:t>Action treatment</w:t>
+            </w:r>
+          </w:p>
+        </w:tc>
+      </w:tr>
+      <w:tr>
+        <w:trPr>
+          <w:cantSplit/>
+        </w:trPr>
+        <w:tc>
+          <w:tcPr>
+            <w:tcW w:type="dxa" w:w="1872"/>
+            <w:tcMar>
+              <w:top w:w="80" w:type="dxa"/>
+              <w:start w:w="100" w:type="dxa"/>
+              <w:bottom w:w="80" w:type="dxa"/>
+              <w:end w:w="100" w:type="dxa"/>
+            </w:tcMar>
+            <w:vAlign w:val="center"/>
+          </w:tcPr>
+          <w:p>
+            <w:pPr>
+              <w:spacing w:before="20" w:after="20"/>
+            </w:pPr>
+            <w:r>
+              <w:rPr>
+                <w:sz w:val="16"/>
+              </w:rPr>
+              <w:t>A — trustworthy OPEN</w:t>
+            </w:r>
+          </w:p>
+        </w:tc>
+        <w:tc>
+          <w:tcPr>
+            <w:tcW w:type="dxa" w:w="2880"/>
+            <w:tcMar>
+              <w:top w:w="80" w:type="dxa"/>
+              <w:start w:w="100" w:type="dxa"/>
+              <w:bottom w:w="80" w:type="dxa"/>
+              <w:end w:w="100" w:type="dxa"/>
+            </w:tcMar>
+            <w:vAlign w:val="center"/>
+          </w:tcPr>
+          <w:p>
+            <w:pPr>
+              <w:spacing w:before="20" w:after="20"/>
+            </w:pPr>
+            <w:r>
+              <w:rPr>
+                <w:sz w:val="16"/>
+              </w:rPr>
+              <w:t>GOOD, FRESH, valid timestamp, observed OPEN</w:t>
+            </w:r>
+          </w:p>
+        </w:tc>
+        <w:tc>
+          <w:tcPr>
+            <w:tcW w:type="dxa" w:w="2160"/>
+            <w:tcMar>
+              <w:top w:w="80" w:type="dxa"/>
+              <w:start w:w="100" w:type="dxa"/>
+              <w:bottom w:w="80" w:type="dxa"/>
+              <w:end w:w="100" w:type="dxa"/>
+            </w:tcMar>
+            <w:vAlign w:val="center"/>
+          </w:tcPr>
+          <w:p>
+            <w:pPr>
+              <w:spacing w:before="20" w:after="20"/>
+            </w:pPr>
+            <w:r>
+              <w:rPr>
+                <w:sz w:val="16"/>
+              </w:rPr>
+              <w:t>PROVEN OPEN / SATISFIED</w:t>
+            </w:r>
+          </w:p>
+        </w:tc>
+        <w:tc>
+          <w:tcPr>
+            <w:tcW w:type="dxa" w:w="2448"/>
+            <w:tcMar>
+              <w:top w:w="80" w:type="dxa"/>
+              <w:start w:w="100" w:type="dxa"/>
+              <w:bottom w:w="80" w:type="dxa"/>
+              <w:end w:w="100" w:type="dxa"/>
+            </w:tcMar>
+            <w:vAlign w:val="center"/>
+          </w:tcPr>
+          <w:p>
+            <w:pPr>
+              <w:spacing w:before="20" w:after="20"/>
+            </w:pPr>
+            <w:r>
+              <w:rPr>
+                <w:sz w:val="16"/>
+              </w:rPr>
+              <w:t>No OPEN command is required or offered.</w:t>
+            </w:r>
+          </w:p>
+        </w:tc>
+      </w:tr>
+      <w:tr>
+        <w:trPr>
+          <w:cantSplit/>
+        </w:trPr>
+        <w:tc>
+          <w:tcPr>
+            <w:tcW w:type="dxa" w:w="1872"/>
+            <w:tcMar>
+              <w:top w:w="80" w:type="dxa"/>
+              <w:start w:w="100" w:type="dxa"/>
+              <w:bottom w:w="80" w:type="dxa"/>
+              <w:end w:w="100" w:type="dxa"/>
+            </w:tcMar>
+            <w:vAlign w:val="center"/>
+          </w:tcPr>
+          <w:p>
+            <w:pPr>
+              <w:spacing w:before="20" w:after="20"/>
+            </w:pPr>
+            <w:r>
+              <w:rPr>
+                <w:sz w:val="16"/>
+              </w:rPr>
+              <w:t>B — trustworthy CLOSED</w:t>
+            </w:r>
+          </w:p>
+        </w:tc>
+        <w:tc>
+          <w:tcPr>
+            <w:tcW w:type="dxa" w:w="2880"/>
+            <w:tcMar>
+              <w:top w:w="80" w:type="dxa"/>
+              <w:start w:w="100" w:type="dxa"/>
+              <w:bottom w:w="80" w:type="dxa"/>
+              <w:end w:w="100" w:type="dxa"/>
+            </w:tcMar>
+            <w:vAlign w:val="center"/>
+          </w:tcPr>
+          <w:p>
+            <w:pPr>
+              <w:spacing w:before="20" w:after="20"/>
+            </w:pPr>
+            <w:r>
+              <w:rPr>
+                <w:sz w:val="16"/>
+              </w:rPr>
+              <w:t>GOOD, FRESH, valid timestamp, observed CLOSED</w:t>
+            </w:r>
+          </w:p>
+        </w:tc>
+        <w:tc>
+          <w:tcPr>
+            <w:tcW w:type="dxa" w:w="2160"/>
+            <w:tcMar>
+              <w:top w:w="80" w:type="dxa"/>
+              <w:start w:w="100" w:type="dxa"/>
+              <w:bottom w:w="80" w:type="dxa"/>
+              <w:end w:w="100" w:type="dxa"/>
+            </w:tcMar>
+            <w:vAlign w:val="center"/>
+          </w:tcPr>
+          <w:p>
+            <w:pPr>
+              <w:spacing w:before="20" w:after="20"/>
+            </w:pPr>
+            <w:r>
+              <w:rPr>
+                <w:sz w:val="16"/>
+              </w:rPr>
+              <w:t>PROVEN CLOSED</w:t>
+            </w:r>
+          </w:p>
+        </w:tc>
+        <w:tc>
+          <w:tcPr>
+            <w:tcW w:type="dxa" w:w="2448"/>
+            <w:tcMar>
+              <w:top w:w="80" w:type="dxa"/>
+              <w:start w:w="100" w:type="dxa"/>
+              <w:bottom w:w="80" w:type="dxa"/>
+              <w:end w:w="100" w:type="dxa"/>
+            </w:tcMar>
+            <w:vAlign w:val="center"/>
+          </w:tcPr>
+          <w:p>
+            <w:pPr>
+              <w:spacing w:before="20" w:after="20"/>
+            </w:pPr>
+            <w:r>
+              <w:rPr>
+                <w:sz w:val="16"/>
+              </w:rPr>
+              <w:t>Offer an OPEN isolation action only when existing workflow and command gates authorise it.</w:t>
+            </w:r>
+          </w:p>
+        </w:tc>
+      </w:tr>
+      <w:tr>
+        <w:trPr>
+          <w:cantSplit/>
+        </w:trPr>
+        <w:tc>
+          <w:tcPr>
+            <w:tcW w:type="dxa" w:w="1872"/>
+            <w:tcMar>
+              <w:top w:w="80" w:type="dxa"/>
+              <w:start w:w="100" w:type="dxa"/>
+              <w:bottom w:w="80" w:type="dxa"/>
+              <w:end w:w="100" w:type="dxa"/>
+            </w:tcMar>
+            <w:vAlign w:val="center"/>
+          </w:tcPr>
+          <w:p>
+            <w:pPr>
+              <w:spacing w:before="20" w:after="20"/>
+            </w:pPr>
+            <w:r>
+              <w:rPr>
+                <w:sz w:val="16"/>
+              </w:rPr>
+              <w:t>C — untrustworthy or absent</w:t>
+            </w:r>
+          </w:p>
+        </w:tc>
+        <w:tc>
+          <w:tcPr>
+            <w:tcW w:type="dxa" w:w="2880"/>
+            <w:tcMar>
+              <w:top w:w="80" w:type="dxa"/>
+              <w:start w:w="100" w:type="dxa"/>
+              <w:bottom w:w="80" w:type="dxa"/>
+              <w:end w:w="100" w:type="dxa"/>
+            </w:tcMar>
+            <w:vAlign w:val="center"/>
+          </w:tcPr>
+          <w:p>
+            <w:pPr>
+              <w:spacing w:before="20" w:after="20"/>
+            </w:pPr>
+            <w:r>
+              <w:rPr>
+                <w:sz w:val="16"/>
+              </w:rPr>
+              <w:t>STALE, UNCERTAIN, BAD, INVALID_TIMESTAMP, or missing required telemetry</w:t>
+            </w:r>
+          </w:p>
+        </w:tc>
+        <w:tc>
+          <w:tcPr>
+            <w:tcW w:type="dxa" w:w="2160"/>
+            <w:tcMar>
+              <w:top w:w="80" w:type="dxa"/>
+              <w:start w:w="100" w:type="dxa"/>
+              <w:bottom w:w="80" w:type="dxa"/>
+              <w:end w:w="100" w:type="dxa"/>
+            </w:tcMar>
+            <w:vAlign w:val="center"/>
+          </w:tcPr>
+          <w:p>
+            <w:pPr>
+              <w:spacing w:before="20" w:after="20"/>
+            </w:pPr>
+            <w:r>
+              <w:rPr>
+                <w:sz w:val="16"/>
+              </w:rPr>
+              <w:t>UNPROVEN</w:t>
+            </w:r>
+          </w:p>
+        </w:tc>
+        <w:tc>
+          <w:tcPr>
+            <w:tcW w:type="dxa" w:w="2448"/>
+            <w:tcMar>
+              <w:top w:w="80" w:type="dxa"/>
+              <w:start w:w="100" w:type="dxa"/>
+              <w:bottom w:w="80" w:type="dxa"/>
+              <w:end w:w="100" w:type="dxa"/>
+            </w:tcMar>
+            <w:vAlign w:val="center"/>
+          </w:tcPr>
+          <w:p>
+            <w:pPr>
+              <w:spacing w:before="20" w:after="20"/>
+            </w:pPr>
+            <w:r>
+              <w:rPr>
+                <w:sz w:val="16"/>
+              </w:rPr>
+              <w:t>Do not offer a redundant OPEN command. Present the evidence deficiency; isolation cannot be completed until trustworthy evidence is restored.</w:t>
+            </w:r>
+          </w:p>
+        </w:tc>
+      </w:tr>
+    </w:tbl>
+    <w:p>
+      <w:pPr>
+        <w:spacing w:after="0"/>
+      </w:pPr>
+    </w:p>
+    <w:p>
+      <w:pPr>
+        <w:spacing w:before="120" w:after="120"/>
+      </w:pPr>
+      <w:r>
+        <w:rPr>
+          <w:b w:val="0"/>
+          <w:i w:val="0"/>
+        </w:rPr>
+        <w:t>After each accepted switching command or valid telemetry update, the demonstrator recalculates boundary status, available isolation actions, active topology, active source paths and the overall isolation proof. More than one eligible OPEN action may be displayed when multiple boundaries are proven CLOSED; any deterministic test order is a procedure choice, not a different engineering rule.</w:t>
+      </w:r>
+    </w:p>
+    <w:p>
+      <w:pPr>
+        <w:pStyle w:val="Heading2"/>
+        <w:keepNext/>
+      </w:pPr>
+      <w:r>
+        <w:t>23.3 Isolation Proof</w:t>
+      </w:r>
+    </w:p>
+    <w:p>
+      <w:pPr>
+        <w:spacing w:before="120" w:after="120"/>
+      </w:pPr>
+      <w:r>
+        <w:rPr>
+          <w:b w:val="0"/>
+          <w:i w:val="0"/>
+        </w:rPr>
+        <w:t>The active fault is proven isolated only when every directly incident switchable boundary is proven OPEN using GOOD, FRESH and timestamp-valid evidence, and topology processing finds zero active paths from every available source to the fault section. A source breaker opened by protection contributes to this proof only when its observed OPEN state is trustworthy. An untrustworthy last-reported OPEN value neither proves isolation nor justifies a redundant OPEN command.</w:t>
+      </w:r>
+    </w:p>
+    <w:p>
+      <w:pPr>
+        <w:pStyle w:val="Heading2"/>
+        <w:keepNext/>
+      </w:pPr>
+      <w:r>
+        <w:t>23.4 Requirement and Change-Control Effect</w:t>
+      </w:r>
+    </w:p>
+    <w:p>
+      <w:pPr>
+        <w:spacing w:before="120" w:after="120"/>
+      </w:pPr>
+      <w:r>
+        <w:rPr>
+          <w:b w:val="0"/>
+          <w:i w:val="0"/>
+        </w:rPr>
+        <w:t>This amendment implements accepted DC-003 beneath existing REQ-NET-009, REQ-TOP-007 and REQ-EXP-004. It introduces no formal requirement and no new V1 behaviour beyond making the already-required generic isolation derivation exact. The System Requirements Specification remains at 124 unique requirements.</w:t>
+      </w:r>
+    </w:p>
+    <w:p>
+      <w:pPr>
+        <w:spacing w:before="160" w:after="160"/>
+        <w:ind w:left="288" w:right="288"/>
+        <w:pBdr>
+          <w:bottom w:val="single" w:sz="12" w:color="188038"/>
+        </w:pBdr>
+      </w:pPr>
+      <w:r>
+        <w:rPr>
+          <w:b/>
+          <w:color w:val="188038"/>
+        </w:rPr>
+        <w:t>V2 Automation Candidate</w:t>
+      </w:r>
+      <w:r>
+        <w:t xml:space="preserve"> — Boundary-incidence comparison, evidence-condition checking and regression impact analysis are repetitive assurance work. A future tool could flag discrepancies for engineer review; V1 retains deterministic configuration-driven processing and controlled validation.</w:t>
       </w:r>
     </w:p>
     <w:sectPr>

</xml_diff>